<commit_message>
solucion tarea 7 completa
</commit_message>
<xml_diff>
--- a/tarea-7/solucion-tarea-7.docx
+++ b/tarea-7/solucion-tarea-7.docx
@@ -5,22 +5,58 @@
     <w:p>
       <w:pPr>
         <w:pStyle w:val="Sinespaciado"/>
-      </w:pPr>
-      <w:r>
-        <w:t>Solucion tarea 7</w:t>
-      </w:r>
-    </w:p>
-    <w:p>
-      <w:pPr>
-        <w:pStyle w:val="Sinespaciado"/>
-      </w:pPr>
-    </w:p>
-    <w:p>
-      <w:pPr>
-        <w:pStyle w:val="Sinespaciado"/>
-      </w:pPr>
-      <w:r>
-        <w:t xml:space="preserve">1. </w:t>
+        <w:jc w:val="center"/>
+        <w:rPr>
+          <w:b/>
+          <w:bCs/>
+          <w:i/>
+          <w:iCs/>
+          <w:sz w:val="30"/>
+          <w:szCs w:val="30"/>
+          <w:u w:val="single"/>
+        </w:rPr>
+      </w:pPr>
+      <w:proofErr w:type="spellStart"/>
+      <w:r>
+        <w:rPr>
+          <w:b/>
+          <w:bCs/>
+          <w:i/>
+          <w:iCs/>
+          <w:sz w:val="30"/>
+          <w:szCs w:val="30"/>
+          <w:u w:val="single"/>
+        </w:rPr>
+        <w:t>Solucion</w:t>
+      </w:r>
+      <w:proofErr w:type="spellEnd"/>
+      <w:r>
+        <w:rPr>
+          <w:b/>
+          <w:bCs/>
+          <w:i/>
+          <w:iCs/>
+          <w:sz w:val="30"/>
+          <w:szCs w:val="30"/>
+          <w:u w:val="single"/>
+        </w:rPr>
+        <w:t xml:space="preserve"> tarea 7</w:t>
+      </w:r>
+    </w:p>
+    <w:p>
+      <w:pPr>
+        <w:pStyle w:val="Sinespaciado"/>
+      </w:pPr>
+    </w:p>
+    <w:p>
+      <w:pPr>
+        <w:pStyle w:val="Sinespaciado"/>
+      </w:pPr>
+      <w:r>
+        <w:t>0</w:t>
+      </w:r>
+      <w:r>
+        <w:t xml:space="preserve">. </w:t>
       </w:r>
       <w:r>
         <w:t xml:space="preserve">Creamos las 3 máquinas necesarias. </w:t>
@@ -47,103 +83,26 @@
         </w:numPr>
       </w:pPr>
       <w:r>
-        <w:t>Nodo 2 y Nodo 3:  Serán los dos esclavos.</w:t>
-      </w:r>
-    </w:p>
-    <w:p>
-      <w:pPr>
-        <w:pStyle w:val="Sinespaciado"/>
-      </w:pPr>
-      <w:r>
-        <w:drawing>
-          <wp:inline distT="0" distB="0" distL="0" distR="0" wp14:anchorId="42169A2B" wp14:editId="20AC6BE5">
-            <wp:extent cx="5400040" cy="1346835"/>
-            <wp:effectExtent l="0" t="0" r="0" b="5715"/>
-            <wp:docPr id="1751293879" name="Imagen 1"/>
-            <wp:cNvGraphicFramePr>
-              <a:graphicFrameLocks xmlns:a="http://schemas.openxmlformats.org/drawingml/2006/main" noChangeAspect="1"/>
-            </wp:cNvGraphicFramePr>
-            <a:graphic xmlns:a="http://schemas.openxmlformats.org/drawingml/2006/main">
-              <a:graphicData uri="http://schemas.openxmlformats.org/drawingml/2006/picture">
-                <pic:pic xmlns:pic="http://schemas.openxmlformats.org/drawingml/2006/picture">
-                  <pic:nvPicPr>
-                    <pic:cNvPr id="1751293879" name=""/>
-                    <pic:cNvPicPr/>
-                  </pic:nvPicPr>
-                  <pic:blipFill>
-                    <a:blip r:embed="rId5"/>
-                    <a:stretch>
-                      <a:fillRect/>
-                    </a:stretch>
-                  </pic:blipFill>
-                  <pic:spPr>
-                    <a:xfrm>
-                      <a:off x="0" y="0"/>
-                      <a:ext cx="5400040" cy="1346835"/>
-                    </a:xfrm>
-                    <a:prstGeom prst="rect">
-                      <a:avLst/>
-                    </a:prstGeom>
-                  </pic:spPr>
-                </pic:pic>
-              </a:graphicData>
-            </a:graphic>
-          </wp:inline>
-        </w:drawing>
-      </w:r>
-    </w:p>
-    <w:p>
-      <w:pPr>
-        <w:pStyle w:val="Sinespaciado"/>
-      </w:pPr>
-    </w:p>
-    <w:p>
-      <w:pPr>
-        <w:pStyle w:val="Sinespaciado"/>
-      </w:pPr>
-      <w:r>
-        <w:t xml:space="preserve">2. </w:t>
-      </w:r>
-      <w:r>
-        <w:t xml:space="preserve">Configuramos </w:t>
-      </w:r>
-      <w:r>
-        <w:t>la red y los hostnames</w:t>
-      </w:r>
-    </w:p>
-    <w:p>
-      <w:pPr>
-        <w:pStyle w:val="Sinespaciado"/>
-      </w:pPr>
-      <w:r>
-        <w:t>2.1 Asignamos hostnames en cada máquina</w:t>
-      </w:r>
-    </w:p>
-    <w:p>
-      <w:pPr>
-        <w:pStyle w:val="Sinespaciado"/>
-      </w:pPr>
-      <w:r>
-        <w:t xml:space="preserve">- </w:t>
-      </w:r>
-      <w:r>
-        <w:t>En la primera máquina le añadimos el nombre de maestro</w:t>
-      </w:r>
-    </w:p>
-    <w:p>
-      <w:pPr>
-        <w:pStyle w:val="Sinespaciado"/>
-        <w:ind w:firstLine="708"/>
+        <w:t>Nodo 2 y Nodo 3:  Serán los dos esclav</w:t>
+      </w:r>
+      <w:r>
+        <w:t>os</w:t>
+      </w:r>
+    </w:p>
+    <w:p>
+      <w:pPr>
+        <w:pStyle w:val="Sinespaciado"/>
+        <w:ind w:left="360"/>
       </w:pPr>
       <w:r>
         <w:rPr>
           <w:noProof/>
         </w:rPr>
         <w:drawing>
-          <wp:inline distT="0" distB="0" distL="0" distR="0" wp14:anchorId="0EED137E" wp14:editId="645D4615">
-            <wp:extent cx="1295400" cy="548640"/>
-            <wp:effectExtent l="0" t="0" r="0" b="3810"/>
-            <wp:docPr id="258207469" name="Imagen 1"/>
+          <wp:inline distT="0" distB="0" distL="0" distR="0" wp14:anchorId="293BD94E" wp14:editId="374FAB8C">
+            <wp:extent cx="5394960" cy="1341120"/>
+            <wp:effectExtent l="0" t="0" r="0" b="0"/>
+            <wp:docPr id="1125963102" name="Imagen 1"/>
             <wp:cNvGraphicFramePr>
               <a:graphicFrameLocks xmlns:a="http://schemas.openxmlformats.org/drawingml/2006/main" noChangeAspect="1"/>
             </wp:cNvGraphicFramePr>
@@ -152,6 +111,85 @@
                 <pic:pic xmlns:pic="http://schemas.openxmlformats.org/drawingml/2006/picture">
                   <pic:nvPicPr>
                     <pic:cNvPr id="0" name="Picture 1"/>
+                    <pic:cNvPicPr>
+                      <a:picLocks noChangeAspect="1" noChangeArrowheads="1"/>
+                    </pic:cNvPicPr>
+                  </pic:nvPicPr>
+                  <pic:blipFill>
+                    <a:blip r:embed="rId5">
+                      <a:extLst>
+                        <a:ext uri="{28A0092B-C50C-407E-A947-70E740481C1C}">
+                          <a14:useLocalDpi xmlns:a14="http://schemas.microsoft.com/office/drawing/2010/main" val="0"/>
+                        </a:ext>
+                      </a:extLst>
+                    </a:blip>
+                    <a:srcRect/>
+                    <a:stretch>
+                      <a:fillRect/>
+                    </a:stretch>
+                  </pic:blipFill>
+                  <pic:spPr bwMode="auto">
+                    <a:xfrm>
+                      <a:off x="0" y="0"/>
+                      <a:ext cx="5394960" cy="1341120"/>
+                    </a:xfrm>
+                    <a:prstGeom prst="rect">
+                      <a:avLst/>
+                    </a:prstGeom>
+                    <a:noFill/>
+                    <a:ln>
+                      <a:noFill/>
+                    </a:ln>
+                  </pic:spPr>
+                </pic:pic>
+              </a:graphicData>
+            </a:graphic>
+          </wp:inline>
+        </w:drawing>
+      </w:r>
+    </w:p>
+    <w:p>
+      <w:pPr>
+        <w:pStyle w:val="Sinespaciado"/>
+      </w:pPr>
+    </w:p>
+    <w:p>
+      <w:pPr>
+        <w:pStyle w:val="Sinespaciado"/>
+      </w:pPr>
+      <w:r>
+        <w:t xml:space="preserve">1. Cambiamos el </w:t>
+      </w:r>
+      <w:proofErr w:type="spellStart"/>
+      <w:r>
+        <w:t>hostname</w:t>
+      </w:r>
+      <w:proofErr w:type="spellEnd"/>
+      <w:r>
+        <w:t xml:space="preserve"> de cada una</w:t>
+      </w:r>
+    </w:p>
+    <w:p>
+      <w:pPr>
+        <w:pStyle w:val="Sinespaciado"/>
+      </w:pPr>
+      <w:r>
+        <w:rPr>
+          <w:noProof/>
+        </w:rPr>
+        <w:drawing>
+          <wp:inline distT="0" distB="0" distL="0" distR="0" wp14:anchorId="62E9FBAE" wp14:editId="09B0B745">
+            <wp:extent cx="3322320" cy="1630680"/>
+            <wp:effectExtent l="0" t="0" r="0" b="7620"/>
+            <wp:docPr id="191291287" name="Imagen 2"/>
+            <wp:cNvGraphicFramePr>
+              <a:graphicFrameLocks xmlns:a="http://schemas.openxmlformats.org/drawingml/2006/main" noChangeAspect="1"/>
+            </wp:cNvGraphicFramePr>
+            <a:graphic xmlns:a="http://schemas.openxmlformats.org/drawingml/2006/main">
+              <a:graphicData uri="http://schemas.openxmlformats.org/drawingml/2006/picture">
+                <pic:pic xmlns:pic="http://schemas.openxmlformats.org/drawingml/2006/picture">
+                  <pic:nvPicPr>
+                    <pic:cNvPr id="0" name="Picture 2"/>
                     <pic:cNvPicPr>
                       <a:picLocks noChangeAspect="1" noChangeArrowheads="1"/>
                     </pic:cNvPicPr>
@@ -172,7 +210,7 @@
                   <pic:spPr bwMode="auto">
                     <a:xfrm>
                       <a:off x="0" y="0"/>
-                      <a:ext cx="1295400" cy="548640"/>
+                      <a:ext cx="3322320" cy="1630680"/>
                     </a:xfrm>
                     <a:prstGeom prst="rect">
                       <a:avLst/>
@@ -194,26 +232,14 @@
         <w:pStyle w:val="Sinespaciado"/>
       </w:pPr>
       <w:r>
-        <w:t xml:space="preserve">- </w:t>
-      </w:r>
-      <w:r>
-        <w:t>En la segunda máquina añadimos el nombre de esclavo-1</w:t>
-      </w:r>
-    </w:p>
-    <w:p>
-      <w:pPr>
-        <w:pStyle w:val="Sinespaciado"/>
-        <w:ind w:firstLine="708"/>
-      </w:pPr>
-      <w:r>
         <w:rPr>
           <w:noProof/>
         </w:rPr>
         <w:drawing>
-          <wp:inline distT="0" distB="0" distL="0" distR="0" wp14:anchorId="779455AB" wp14:editId="0D64D6B3">
-            <wp:extent cx="1243330" cy="509905"/>
-            <wp:effectExtent l="0" t="0" r="0" b="4445"/>
-            <wp:docPr id="542459983" name="Imagen 3"/>
+          <wp:inline distT="0" distB="0" distL="0" distR="0" wp14:anchorId="16C63009" wp14:editId="5F05F60A">
+            <wp:extent cx="2720340" cy="1341120"/>
+            <wp:effectExtent l="0" t="0" r="3810" b="0"/>
+            <wp:docPr id="795847157" name="Imagen 3"/>
             <wp:cNvGraphicFramePr>
               <a:graphicFrameLocks xmlns:a="http://schemas.openxmlformats.org/drawingml/2006/main" noChangeAspect="1"/>
             </wp:cNvGraphicFramePr>
@@ -221,7 +247,7 @@
               <a:graphicData uri="http://schemas.openxmlformats.org/drawingml/2006/picture">
                 <pic:pic xmlns:pic="http://schemas.openxmlformats.org/drawingml/2006/picture">
                   <pic:nvPicPr>
-                    <pic:cNvPr id="0" name="Picture 2"/>
+                    <pic:cNvPr id="0" name="Picture 3"/>
                     <pic:cNvPicPr>
                       <a:picLocks noChangeAspect="1" noChangeArrowheads="1"/>
                     </pic:cNvPicPr>
@@ -242,7 +268,7 @@
                   <pic:spPr bwMode="auto">
                     <a:xfrm>
                       <a:off x="0" y="0"/>
-                      <a:ext cx="1243330" cy="509905"/>
+                      <a:ext cx="2720340" cy="1341120"/>
                     </a:xfrm>
                     <a:prstGeom prst="rect">
                       <a:avLst/>
@@ -262,25 +288,25 @@
     <w:p>
       <w:pPr>
         <w:pStyle w:val="Sinespaciado"/>
-      </w:pPr>
-      <w:r>
-        <w:t>- En la tercera máquina añadimos el nombre de esclavo-2</w:t>
-      </w:r>
-    </w:p>
-    <w:p>
-      <w:pPr>
-        <w:pStyle w:val="Sinespaciado"/>
-        <w:ind w:firstLine="708"/>
+        <w:rPr>
+          <w:sz w:val="2"/>
+          <w:szCs w:val="2"/>
+        </w:rPr>
+      </w:pPr>
+    </w:p>
+    <w:p>
+      <w:pPr>
+        <w:pStyle w:val="Sinespaciado"/>
       </w:pPr>
       <w:r>
         <w:rPr>
           <w:noProof/>
         </w:rPr>
         <w:drawing>
-          <wp:inline distT="0" distB="0" distL="0" distR="0" wp14:anchorId="1633C169" wp14:editId="5A8F995B">
-            <wp:extent cx="1733550" cy="542925"/>
-            <wp:effectExtent l="0" t="0" r="0" b="9525"/>
-            <wp:docPr id="1377199494" name="Imagen 1"/>
+          <wp:inline distT="0" distB="0" distL="0" distR="0" wp14:anchorId="372F54B9" wp14:editId="2EC38ACD">
+            <wp:extent cx="2743200" cy="1082040"/>
+            <wp:effectExtent l="0" t="0" r="0" b="3810"/>
+            <wp:docPr id="1189999141" name="Imagen 4"/>
             <wp:cNvGraphicFramePr>
               <a:graphicFrameLocks xmlns:a="http://schemas.openxmlformats.org/drawingml/2006/main" noChangeAspect="1"/>
             </wp:cNvGraphicFramePr>
@@ -288,11 +314,1369 @@
               <a:graphicData uri="http://schemas.openxmlformats.org/drawingml/2006/picture">
                 <pic:pic xmlns:pic="http://schemas.openxmlformats.org/drawingml/2006/picture">
                   <pic:nvPicPr>
-                    <pic:cNvPr id="1377199494" name=""/>
+                    <pic:cNvPr id="0" name="Picture 4"/>
+                    <pic:cNvPicPr>
+                      <a:picLocks noChangeAspect="1" noChangeArrowheads="1"/>
+                    </pic:cNvPicPr>
+                  </pic:nvPicPr>
+                  <pic:blipFill>
+                    <a:blip r:embed="rId8">
+                      <a:extLst>
+                        <a:ext uri="{28A0092B-C50C-407E-A947-70E740481C1C}">
+                          <a14:useLocalDpi xmlns:a14="http://schemas.microsoft.com/office/drawing/2010/main" val="0"/>
+                        </a:ext>
+                      </a:extLst>
+                    </a:blip>
+                    <a:srcRect/>
+                    <a:stretch>
+                      <a:fillRect/>
+                    </a:stretch>
+                  </pic:blipFill>
+                  <pic:spPr bwMode="auto">
+                    <a:xfrm>
+                      <a:off x="0" y="0"/>
+                      <a:ext cx="2743200" cy="1082040"/>
+                    </a:xfrm>
+                    <a:prstGeom prst="rect">
+                      <a:avLst/>
+                    </a:prstGeom>
+                    <a:noFill/>
+                    <a:ln>
+                      <a:noFill/>
+                    </a:ln>
+                  </pic:spPr>
+                </pic:pic>
+              </a:graphicData>
+            </a:graphic>
+          </wp:inline>
+        </w:drawing>
+      </w:r>
+    </w:p>
+    <w:p>
+      <w:pPr>
+        <w:pStyle w:val="Sinespaciado"/>
+      </w:pPr>
+    </w:p>
+    <w:p>
+      <w:r>
+        <w:br w:type="page"/>
+      </w:r>
+    </w:p>
+    <w:p>
+      <w:pPr>
+        <w:pStyle w:val="Sinespaciado"/>
+      </w:pPr>
+      <w:r>
+        <w:lastRenderedPageBreak/>
+        <w:t>2. Editamos el archivo /</w:t>
+      </w:r>
+      <w:proofErr w:type="spellStart"/>
+      <w:r>
+        <w:t>etc</w:t>
+      </w:r>
+      <w:proofErr w:type="spellEnd"/>
+      <w:r>
+        <w:t>/hosts para que las máquinas se reconozcan entre s</w:t>
+      </w:r>
+      <w:r>
+        <w:t>í</w:t>
+      </w:r>
+      <w:r>
+        <w:t xml:space="preserve">. </w:t>
+      </w:r>
+    </w:p>
+    <w:p>
+      <w:pPr>
+        <w:pStyle w:val="Sinespaciado"/>
+      </w:pPr>
+      <w:r>
+        <w:t xml:space="preserve">- </w:t>
+      </w:r>
+      <w:r>
+        <w:t>Lo abrimos con el comando sudo nano /</w:t>
+      </w:r>
+      <w:proofErr w:type="spellStart"/>
+      <w:r>
+        <w:t>etc</w:t>
+      </w:r>
+      <w:proofErr w:type="spellEnd"/>
+      <w:r>
+        <w:t>/hosts</w:t>
+      </w:r>
+    </w:p>
+    <w:p>
+      <w:pPr>
+        <w:pStyle w:val="Sinespaciado"/>
+      </w:pPr>
+      <w:r>
+        <w:rPr>
+          <w:noProof/>
+        </w:rPr>
+        <w:drawing>
+          <wp:inline distT="0" distB="0" distL="0" distR="0" wp14:anchorId="76BD9F32" wp14:editId="61EF4F9D">
+            <wp:extent cx="3444240" cy="2026920"/>
+            <wp:effectExtent l="0" t="0" r="3810" b="0"/>
+            <wp:docPr id="2097798133" name="Imagen 1"/>
+            <wp:cNvGraphicFramePr>
+              <a:graphicFrameLocks xmlns:a="http://schemas.openxmlformats.org/drawingml/2006/main" noChangeAspect="1"/>
+            </wp:cNvGraphicFramePr>
+            <a:graphic xmlns:a="http://schemas.openxmlformats.org/drawingml/2006/main">
+              <a:graphicData uri="http://schemas.openxmlformats.org/drawingml/2006/picture">
+                <pic:pic xmlns:pic="http://schemas.openxmlformats.org/drawingml/2006/picture">
+                  <pic:nvPicPr>
+                    <pic:cNvPr id="0" name="Picture 1"/>
+                    <pic:cNvPicPr>
+                      <a:picLocks noChangeAspect="1" noChangeArrowheads="1"/>
+                    </pic:cNvPicPr>
+                  </pic:nvPicPr>
+                  <pic:blipFill>
+                    <a:blip r:embed="rId9">
+                      <a:extLst>
+                        <a:ext uri="{28A0092B-C50C-407E-A947-70E740481C1C}">
+                          <a14:useLocalDpi xmlns:a14="http://schemas.microsoft.com/office/drawing/2010/main" val="0"/>
+                        </a:ext>
+                      </a:extLst>
+                    </a:blip>
+                    <a:srcRect/>
+                    <a:stretch>
+                      <a:fillRect/>
+                    </a:stretch>
+                  </pic:blipFill>
+                  <pic:spPr bwMode="auto">
+                    <a:xfrm>
+                      <a:off x="0" y="0"/>
+                      <a:ext cx="3444240" cy="2026920"/>
+                    </a:xfrm>
+                    <a:prstGeom prst="rect">
+                      <a:avLst/>
+                    </a:prstGeom>
+                    <a:noFill/>
+                    <a:ln>
+                      <a:noFill/>
+                    </a:ln>
+                  </pic:spPr>
+                </pic:pic>
+              </a:graphicData>
+            </a:graphic>
+          </wp:inline>
+        </w:drawing>
+      </w:r>
+    </w:p>
+    <w:p>
+      <w:pPr>
+        <w:pStyle w:val="Sinespaciado"/>
+      </w:pPr>
+    </w:p>
+    <w:p>
+      <w:pPr>
+        <w:pStyle w:val="Sinespaciado"/>
+      </w:pPr>
+    </w:p>
+    <w:p>
+      <w:pPr>
+        <w:pStyle w:val="Sinespaciado"/>
+      </w:pPr>
+      <w:r>
+        <w:t xml:space="preserve">3. </w:t>
+      </w:r>
+      <w:r>
+        <w:t xml:space="preserve">Generamos la clave </w:t>
+      </w:r>
+      <w:proofErr w:type="spellStart"/>
+      <w:r>
+        <w:t>ssh</w:t>
+      </w:r>
+      <w:proofErr w:type="spellEnd"/>
+      <w:r>
+        <w:t xml:space="preserve"> para que el nodo 1 se pueda conectar a los dos esclavos</w:t>
+      </w:r>
+    </w:p>
+    <w:p>
+      <w:pPr>
+        <w:pStyle w:val="Sinespaciado"/>
+      </w:pPr>
+      <w:r>
+        <w:rPr>
+          <w:noProof/>
+        </w:rPr>
+        <w:drawing>
+          <wp:inline distT="0" distB="0" distL="0" distR="0" wp14:anchorId="2BC2FE98" wp14:editId="4DEA1EA0">
+            <wp:extent cx="5402580" cy="1722120"/>
+            <wp:effectExtent l="0" t="0" r="7620" b="0"/>
+            <wp:docPr id="428882896" name="Imagen 2"/>
+            <wp:cNvGraphicFramePr>
+              <a:graphicFrameLocks xmlns:a="http://schemas.openxmlformats.org/drawingml/2006/main" noChangeAspect="1"/>
+            </wp:cNvGraphicFramePr>
+            <a:graphic xmlns:a="http://schemas.openxmlformats.org/drawingml/2006/main">
+              <a:graphicData uri="http://schemas.openxmlformats.org/drawingml/2006/picture">
+                <pic:pic xmlns:pic="http://schemas.openxmlformats.org/drawingml/2006/picture">
+                  <pic:nvPicPr>
+                    <pic:cNvPr id="0" name="Picture 2"/>
+                    <pic:cNvPicPr>
+                      <a:picLocks noChangeAspect="1" noChangeArrowheads="1"/>
+                    </pic:cNvPicPr>
+                  </pic:nvPicPr>
+                  <pic:blipFill>
+                    <a:blip r:embed="rId10">
+                      <a:extLst>
+                        <a:ext uri="{28A0092B-C50C-407E-A947-70E740481C1C}">
+                          <a14:useLocalDpi xmlns:a14="http://schemas.microsoft.com/office/drawing/2010/main" val="0"/>
+                        </a:ext>
+                      </a:extLst>
+                    </a:blip>
+                    <a:srcRect/>
+                    <a:stretch>
+                      <a:fillRect/>
+                    </a:stretch>
+                  </pic:blipFill>
+                  <pic:spPr bwMode="auto">
+                    <a:xfrm>
+                      <a:off x="0" y="0"/>
+                      <a:ext cx="5402580" cy="1722120"/>
+                    </a:xfrm>
+                    <a:prstGeom prst="rect">
+                      <a:avLst/>
+                    </a:prstGeom>
+                    <a:noFill/>
+                    <a:ln>
+                      <a:noFill/>
+                    </a:ln>
+                  </pic:spPr>
+                </pic:pic>
+              </a:graphicData>
+            </a:graphic>
+          </wp:inline>
+        </w:drawing>
+      </w:r>
+    </w:p>
+    <w:p>
+      <w:pPr>
+        <w:pStyle w:val="Sinespaciado"/>
+      </w:pPr>
+    </w:p>
+    <w:p>
+      <w:r>
+        <w:br w:type="page"/>
+      </w:r>
+    </w:p>
+    <w:p>
+      <w:pPr>
+        <w:pStyle w:val="Sinespaciado"/>
+      </w:pPr>
+      <w:r>
+        <w:lastRenderedPageBreak/>
+        <w:t>4. Configuramos Hadoop</w:t>
+      </w:r>
+    </w:p>
+    <w:p>
+      <w:pPr>
+        <w:pStyle w:val="Sinespaciado"/>
+      </w:pPr>
+      <w:r>
+        <w:t xml:space="preserve">- </w:t>
+      </w:r>
+      <w:r>
+        <w:t>core-site.xml: Editamos el archivo</w:t>
+      </w:r>
+    </w:p>
+    <w:p>
+      <w:pPr>
+        <w:pStyle w:val="Sinespaciado"/>
+      </w:pPr>
+      <w:r>
+        <w:rPr>
+          <w:noProof/>
+        </w:rPr>
+        <w:drawing>
+          <wp:inline distT="0" distB="0" distL="0" distR="0" wp14:anchorId="214DD7E5" wp14:editId="0D35F4FC">
+            <wp:extent cx="5402580" cy="2255520"/>
+            <wp:effectExtent l="0" t="0" r="7620" b="0"/>
+            <wp:docPr id="1567239129" name="Imagen 3"/>
+            <wp:cNvGraphicFramePr>
+              <a:graphicFrameLocks xmlns:a="http://schemas.openxmlformats.org/drawingml/2006/main" noChangeAspect="1"/>
+            </wp:cNvGraphicFramePr>
+            <a:graphic xmlns:a="http://schemas.openxmlformats.org/drawingml/2006/main">
+              <a:graphicData uri="http://schemas.openxmlformats.org/drawingml/2006/picture">
+                <pic:pic xmlns:pic="http://schemas.openxmlformats.org/drawingml/2006/picture">
+                  <pic:nvPicPr>
+                    <pic:cNvPr id="0" name="Picture 3"/>
+                    <pic:cNvPicPr>
+                      <a:picLocks noChangeAspect="1" noChangeArrowheads="1"/>
+                    </pic:cNvPicPr>
+                  </pic:nvPicPr>
+                  <pic:blipFill>
+                    <a:blip r:embed="rId11">
+                      <a:extLst>
+                        <a:ext uri="{28A0092B-C50C-407E-A947-70E740481C1C}">
+                          <a14:useLocalDpi xmlns:a14="http://schemas.microsoft.com/office/drawing/2010/main" val="0"/>
+                        </a:ext>
+                      </a:extLst>
+                    </a:blip>
+                    <a:srcRect/>
+                    <a:stretch>
+                      <a:fillRect/>
+                    </a:stretch>
+                  </pic:blipFill>
+                  <pic:spPr bwMode="auto">
+                    <a:xfrm>
+                      <a:off x="0" y="0"/>
+                      <a:ext cx="5402580" cy="2255520"/>
+                    </a:xfrm>
+                    <a:prstGeom prst="rect">
+                      <a:avLst/>
+                    </a:prstGeom>
+                    <a:noFill/>
+                    <a:ln>
+                      <a:noFill/>
+                    </a:ln>
+                  </pic:spPr>
+                </pic:pic>
+              </a:graphicData>
+            </a:graphic>
+          </wp:inline>
+        </w:drawing>
+      </w:r>
+    </w:p>
+    <w:p>
+      <w:pPr>
+        <w:pStyle w:val="Sinespaciado"/>
+      </w:pPr>
+      <w:r>
+        <w:t>- yarn-site.xml</w:t>
+      </w:r>
+    </w:p>
+    <w:p>
+      <w:pPr>
+        <w:pStyle w:val="Sinespaciado"/>
+      </w:pPr>
+      <w:r>
+        <w:rPr>
+          <w:noProof/>
+        </w:rPr>
+        <w:drawing>
+          <wp:inline distT="0" distB="0" distL="0" distR="0" wp14:anchorId="6B3C4D8E" wp14:editId="6C7D1AD1">
+            <wp:extent cx="3336642" cy="2346960"/>
+            <wp:effectExtent l="0" t="0" r="0" b="0"/>
+            <wp:docPr id="369920549" name="Imagen 4"/>
+            <wp:cNvGraphicFramePr>
+              <a:graphicFrameLocks xmlns:a="http://schemas.openxmlformats.org/drawingml/2006/main" noChangeAspect="1"/>
+            </wp:cNvGraphicFramePr>
+            <a:graphic xmlns:a="http://schemas.openxmlformats.org/drawingml/2006/main">
+              <a:graphicData uri="http://schemas.openxmlformats.org/drawingml/2006/picture">
+                <pic:pic xmlns:pic="http://schemas.openxmlformats.org/drawingml/2006/picture">
+                  <pic:nvPicPr>
+                    <pic:cNvPr id="0" name="Picture 4"/>
+                    <pic:cNvPicPr>
+                      <a:picLocks noChangeAspect="1" noChangeArrowheads="1"/>
+                    </pic:cNvPicPr>
+                  </pic:nvPicPr>
+                  <pic:blipFill>
+                    <a:blip r:embed="rId12">
+                      <a:extLst>
+                        <a:ext uri="{28A0092B-C50C-407E-A947-70E740481C1C}">
+                          <a14:useLocalDpi xmlns:a14="http://schemas.microsoft.com/office/drawing/2010/main" val="0"/>
+                        </a:ext>
+                      </a:extLst>
+                    </a:blip>
+                    <a:srcRect/>
+                    <a:stretch>
+                      <a:fillRect/>
+                    </a:stretch>
+                  </pic:blipFill>
+                  <pic:spPr bwMode="auto">
+                    <a:xfrm>
+                      <a:off x="0" y="0"/>
+                      <a:ext cx="3340387" cy="2349594"/>
+                    </a:xfrm>
+                    <a:prstGeom prst="rect">
+                      <a:avLst/>
+                    </a:prstGeom>
+                    <a:noFill/>
+                    <a:ln>
+                      <a:noFill/>
+                    </a:ln>
+                  </pic:spPr>
+                </pic:pic>
+              </a:graphicData>
+            </a:graphic>
+          </wp:inline>
+        </w:drawing>
+      </w:r>
+    </w:p>
+    <w:p>
+      <w:pPr>
+        <w:pStyle w:val="Sinespaciado"/>
+      </w:pPr>
+      <w:r>
+        <w:t>- hdfs-site.xml</w:t>
+      </w:r>
+    </w:p>
+    <w:p>
+      <w:pPr>
+        <w:pStyle w:val="Sinespaciado"/>
+      </w:pPr>
+      <w:r>
+        <w:rPr>
+          <w:noProof/>
+        </w:rPr>
+        <w:drawing>
+          <wp:inline distT="0" distB="0" distL="0" distR="0" wp14:anchorId="3A99486D" wp14:editId="323D226D">
+            <wp:extent cx="3127169" cy="1958340"/>
+            <wp:effectExtent l="0" t="0" r="0" b="3810"/>
+            <wp:docPr id="1078513925" name="Imagen 5"/>
+            <wp:cNvGraphicFramePr>
+              <a:graphicFrameLocks xmlns:a="http://schemas.openxmlformats.org/drawingml/2006/main" noChangeAspect="1"/>
+            </wp:cNvGraphicFramePr>
+            <a:graphic xmlns:a="http://schemas.openxmlformats.org/drawingml/2006/main">
+              <a:graphicData uri="http://schemas.openxmlformats.org/drawingml/2006/picture">
+                <pic:pic xmlns:pic="http://schemas.openxmlformats.org/drawingml/2006/picture">
+                  <pic:nvPicPr>
+                    <pic:cNvPr id="0" name="Picture 5"/>
+                    <pic:cNvPicPr>
+                      <a:picLocks noChangeAspect="1" noChangeArrowheads="1"/>
+                    </pic:cNvPicPr>
+                  </pic:nvPicPr>
+                  <pic:blipFill>
+                    <a:blip r:embed="rId13" cstate="print">
+                      <a:extLst>
+                        <a:ext uri="{28A0092B-C50C-407E-A947-70E740481C1C}">
+                          <a14:useLocalDpi xmlns:a14="http://schemas.microsoft.com/office/drawing/2010/main" val="0"/>
+                        </a:ext>
+                      </a:extLst>
+                    </a:blip>
+                    <a:srcRect/>
+                    <a:stretch>
+                      <a:fillRect/>
+                    </a:stretch>
+                  </pic:blipFill>
+                  <pic:spPr bwMode="auto">
+                    <a:xfrm>
+                      <a:off x="0" y="0"/>
+                      <a:ext cx="3132195" cy="1961487"/>
+                    </a:xfrm>
+                    <a:prstGeom prst="rect">
+                      <a:avLst/>
+                    </a:prstGeom>
+                    <a:noFill/>
+                    <a:ln>
+                      <a:noFill/>
+                    </a:ln>
+                  </pic:spPr>
+                </pic:pic>
+              </a:graphicData>
+            </a:graphic>
+          </wp:inline>
+        </w:drawing>
+      </w:r>
+    </w:p>
+    <w:p/>
+    <w:p>
+      <w:r>
+        <w:t xml:space="preserve">- </w:t>
+      </w:r>
+      <w:proofErr w:type="spellStart"/>
+      <w:r>
+        <w:t>workers</w:t>
+      </w:r>
+      <w:proofErr w:type="spellEnd"/>
+    </w:p>
+    <w:p>
+      <w:r>
+        <w:rPr>
+          <w:noProof/>
+        </w:rPr>
+        <w:drawing>
+          <wp:inline distT="0" distB="0" distL="0" distR="0" wp14:anchorId="43D33BAA" wp14:editId="131C0986">
+            <wp:extent cx="5387340" cy="358140"/>
+            <wp:effectExtent l="0" t="0" r="3810" b="3810"/>
+            <wp:docPr id="313336410" name="Imagen 6"/>
+            <wp:cNvGraphicFramePr>
+              <a:graphicFrameLocks xmlns:a="http://schemas.openxmlformats.org/drawingml/2006/main" noChangeAspect="1"/>
+            </wp:cNvGraphicFramePr>
+            <a:graphic xmlns:a="http://schemas.openxmlformats.org/drawingml/2006/main">
+              <a:graphicData uri="http://schemas.openxmlformats.org/drawingml/2006/picture">
+                <pic:pic xmlns:pic="http://schemas.openxmlformats.org/drawingml/2006/picture">
+                  <pic:nvPicPr>
+                    <pic:cNvPr id="0" name="Picture 6"/>
+                    <pic:cNvPicPr>
+                      <a:picLocks noChangeAspect="1" noChangeArrowheads="1"/>
+                    </pic:cNvPicPr>
+                  </pic:nvPicPr>
+                  <pic:blipFill>
+                    <a:blip r:embed="rId14">
+                      <a:extLst>
+                        <a:ext uri="{28A0092B-C50C-407E-A947-70E740481C1C}">
+                          <a14:useLocalDpi xmlns:a14="http://schemas.microsoft.com/office/drawing/2010/main" val="0"/>
+                        </a:ext>
+                      </a:extLst>
+                    </a:blip>
+                    <a:srcRect/>
+                    <a:stretch>
+                      <a:fillRect/>
+                    </a:stretch>
+                  </pic:blipFill>
+                  <pic:spPr bwMode="auto">
+                    <a:xfrm>
+                      <a:off x="0" y="0"/>
+                      <a:ext cx="5387340" cy="358140"/>
+                    </a:xfrm>
+                    <a:prstGeom prst="rect">
+                      <a:avLst/>
+                    </a:prstGeom>
+                    <a:noFill/>
+                    <a:ln>
+                      <a:noFill/>
+                    </a:ln>
+                  </pic:spPr>
+                </pic:pic>
+              </a:graphicData>
+            </a:graphic>
+          </wp:inline>
+        </w:drawing>
+      </w:r>
+    </w:p>
+    <w:p>
+      <w:r>
+        <w:br w:type="page"/>
+      </w:r>
+    </w:p>
+    <w:p>
+      <w:pPr>
+        <w:pStyle w:val="Sinespaciado"/>
+      </w:pPr>
+      <w:r>
+        <w:lastRenderedPageBreak/>
+        <w:t>5. Copiamos la configuración del paso 4 en los nodos 2 y 3</w:t>
+      </w:r>
+    </w:p>
+    <w:p>
+      <w:pPr>
+        <w:pStyle w:val="Sinespaciado"/>
+      </w:pPr>
+      <w:r>
+        <w:t>- Lo hacemos para el nodo 2</w:t>
+      </w:r>
+      <w:r>
+        <w:rPr>
+          <w:noProof/>
+        </w:rPr>
+        <w:drawing>
+          <wp:inline distT="0" distB="0" distL="0" distR="0" wp14:anchorId="4754CF83" wp14:editId="4570ACDD">
+            <wp:extent cx="5402580" cy="3810000"/>
+            <wp:effectExtent l="0" t="0" r="7620" b="0"/>
+            <wp:docPr id="277292784" name="Imagen 7"/>
+            <wp:cNvGraphicFramePr>
+              <a:graphicFrameLocks xmlns:a="http://schemas.openxmlformats.org/drawingml/2006/main" noChangeAspect="1"/>
+            </wp:cNvGraphicFramePr>
+            <a:graphic xmlns:a="http://schemas.openxmlformats.org/drawingml/2006/main">
+              <a:graphicData uri="http://schemas.openxmlformats.org/drawingml/2006/picture">
+                <pic:pic xmlns:pic="http://schemas.openxmlformats.org/drawingml/2006/picture">
+                  <pic:nvPicPr>
+                    <pic:cNvPr id="0" name="Picture 7"/>
+                    <pic:cNvPicPr>
+                      <a:picLocks noChangeAspect="1" noChangeArrowheads="1"/>
+                    </pic:cNvPicPr>
+                  </pic:nvPicPr>
+                  <pic:blipFill>
+                    <a:blip r:embed="rId15">
+                      <a:extLst>
+                        <a:ext uri="{28A0092B-C50C-407E-A947-70E740481C1C}">
+                          <a14:useLocalDpi xmlns:a14="http://schemas.microsoft.com/office/drawing/2010/main" val="0"/>
+                        </a:ext>
+                      </a:extLst>
+                    </a:blip>
+                    <a:srcRect/>
+                    <a:stretch>
+                      <a:fillRect/>
+                    </a:stretch>
+                  </pic:blipFill>
+                  <pic:spPr bwMode="auto">
+                    <a:xfrm>
+                      <a:off x="0" y="0"/>
+                      <a:ext cx="5402580" cy="3810000"/>
+                    </a:xfrm>
+                    <a:prstGeom prst="rect">
+                      <a:avLst/>
+                    </a:prstGeom>
+                    <a:noFill/>
+                    <a:ln>
+                      <a:noFill/>
+                    </a:ln>
+                  </pic:spPr>
+                </pic:pic>
+              </a:graphicData>
+            </a:graphic>
+          </wp:inline>
+        </w:drawing>
+      </w:r>
+    </w:p>
+    <w:p>
+      <w:pPr>
+        <w:pStyle w:val="Sinespaciado"/>
+      </w:pPr>
+      <w:r>
+        <w:t>Lo hacemos para el nodo 3</w:t>
+      </w:r>
+    </w:p>
+    <w:p>
+      <w:pPr>
+        <w:pStyle w:val="Sinespaciado"/>
+      </w:pPr>
+      <w:r>
+        <w:rPr>
+          <w:noProof/>
+        </w:rPr>
+        <w:drawing>
+          <wp:inline distT="0" distB="0" distL="0" distR="0" wp14:anchorId="5D8743CF" wp14:editId="217D651F">
+            <wp:extent cx="5402580" cy="3931920"/>
+            <wp:effectExtent l="0" t="0" r="7620" b="0"/>
+            <wp:docPr id="1949538018" name="Imagen 10"/>
+            <wp:cNvGraphicFramePr>
+              <a:graphicFrameLocks xmlns:a="http://schemas.openxmlformats.org/drawingml/2006/main" noChangeAspect="1"/>
+            </wp:cNvGraphicFramePr>
+            <a:graphic xmlns:a="http://schemas.openxmlformats.org/drawingml/2006/main">
+              <a:graphicData uri="http://schemas.openxmlformats.org/drawingml/2006/picture">
+                <pic:pic xmlns:pic="http://schemas.openxmlformats.org/drawingml/2006/picture">
+                  <pic:nvPicPr>
+                    <pic:cNvPr id="0" name="Picture 10"/>
+                    <pic:cNvPicPr>
+                      <a:picLocks noChangeAspect="1" noChangeArrowheads="1"/>
+                    </pic:cNvPicPr>
+                  </pic:nvPicPr>
+                  <pic:blipFill>
+                    <a:blip r:embed="rId16">
+                      <a:extLst>
+                        <a:ext uri="{28A0092B-C50C-407E-A947-70E740481C1C}">
+                          <a14:useLocalDpi xmlns:a14="http://schemas.microsoft.com/office/drawing/2010/main" val="0"/>
+                        </a:ext>
+                      </a:extLst>
+                    </a:blip>
+                    <a:srcRect/>
+                    <a:stretch>
+                      <a:fillRect/>
+                    </a:stretch>
+                  </pic:blipFill>
+                  <pic:spPr bwMode="auto">
+                    <a:xfrm>
+                      <a:off x="0" y="0"/>
+                      <a:ext cx="5402580" cy="3931920"/>
+                    </a:xfrm>
+                    <a:prstGeom prst="rect">
+                      <a:avLst/>
+                    </a:prstGeom>
+                    <a:noFill/>
+                    <a:ln>
+                      <a:noFill/>
+                    </a:ln>
+                  </pic:spPr>
+                </pic:pic>
+              </a:graphicData>
+            </a:graphic>
+          </wp:inline>
+        </w:drawing>
+      </w:r>
+    </w:p>
+    <w:p>
+      <w:r>
+        <w:br w:type="page"/>
+      </w:r>
+    </w:p>
+    <w:p>
+      <w:pPr>
+        <w:pStyle w:val="Sinespaciado"/>
+      </w:pPr>
+      <w:r>
+        <w:lastRenderedPageBreak/>
+        <w:t>6. Limpiamos los datos de los esclavos (mismo comando en ambos esclavos)</w:t>
+      </w:r>
+    </w:p>
+    <w:p>
+      <w:pPr>
+        <w:pStyle w:val="Sinespaciado"/>
+      </w:pPr>
+      <w:r>
+        <w:rPr>
+          <w:noProof/>
+        </w:rPr>
+        <w:drawing>
+          <wp:inline distT="0" distB="0" distL="0" distR="0" wp14:anchorId="5EE36381" wp14:editId="45949783">
+            <wp:extent cx="4770120" cy="1287780"/>
+            <wp:effectExtent l="0" t="0" r="0" b="7620"/>
+            <wp:docPr id="1396934381" name="Imagen 11"/>
+            <wp:cNvGraphicFramePr>
+              <a:graphicFrameLocks xmlns:a="http://schemas.openxmlformats.org/drawingml/2006/main" noChangeAspect="1"/>
+            </wp:cNvGraphicFramePr>
+            <a:graphic xmlns:a="http://schemas.openxmlformats.org/drawingml/2006/main">
+              <a:graphicData uri="http://schemas.openxmlformats.org/drawingml/2006/picture">
+                <pic:pic xmlns:pic="http://schemas.openxmlformats.org/drawingml/2006/picture">
+                  <pic:nvPicPr>
+                    <pic:cNvPr id="0" name="Picture 11"/>
+                    <pic:cNvPicPr>
+                      <a:picLocks noChangeAspect="1" noChangeArrowheads="1"/>
+                    </pic:cNvPicPr>
+                  </pic:nvPicPr>
+                  <pic:blipFill>
+                    <a:blip r:embed="rId17">
+                      <a:extLst>
+                        <a:ext uri="{28A0092B-C50C-407E-A947-70E740481C1C}">
+                          <a14:useLocalDpi xmlns:a14="http://schemas.microsoft.com/office/drawing/2010/main" val="0"/>
+                        </a:ext>
+                      </a:extLst>
+                    </a:blip>
+                    <a:srcRect/>
+                    <a:stretch>
+                      <a:fillRect/>
+                    </a:stretch>
+                  </pic:blipFill>
+                  <pic:spPr bwMode="auto">
+                    <a:xfrm>
+                      <a:off x="0" y="0"/>
+                      <a:ext cx="4770120" cy="1287780"/>
+                    </a:xfrm>
+                    <a:prstGeom prst="rect">
+                      <a:avLst/>
+                    </a:prstGeom>
+                    <a:noFill/>
+                    <a:ln>
+                      <a:noFill/>
+                    </a:ln>
+                  </pic:spPr>
+                </pic:pic>
+              </a:graphicData>
+            </a:graphic>
+          </wp:inline>
+        </w:drawing>
+      </w:r>
+    </w:p>
+    <w:p>
+      <w:pPr>
+        <w:pStyle w:val="Sinespaciado"/>
+      </w:pPr>
+    </w:p>
+    <w:p>
+      <w:pPr>
+        <w:pStyle w:val="Sinespaciado"/>
+      </w:pPr>
+      <w:r>
+        <w:t xml:space="preserve">7. Formateamos el </w:t>
+      </w:r>
+      <w:proofErr w:type="spellStart"/>
+      <w:r>
+        <w:t>namenode</w:t>
+      </w:r>
+      <w:proofErr w:type="spellEnd"/>
+      <w:r>
+        <w:t xml:space="preserve"> de</w:t>
+      </w:r>
+      <w:r>
+        <w:t xml:space="preserve"> la máquina maestra</w:t>
+      </w:r>
+    </w:p>
+    <w:p>
+      <w:pPr>
+        <w:pStyle w:val="Sinespaciado"/>
+      </w:pPr>
+      <w:r>
+        <w:rPr>
+          <w:noProof/>
+        </w:rPr>
+        <w:drawing>
+          <wp:inline distT="0" distB="0" distL="0" distR="0" wp14:anchorId="593C84A0" wp14:editId="591914BB">
+            <wp:extent cx="5394960" cy="1303020"/>
+            <wp:effectExtent l="0" t="0" r="0" b="0"/>
+            <wp:docPr id="1167378388" name="Imagen 12"/>
+            <wp:cNvGraphicFramePr>
+              <a:graphicFrameLocks xmlns:a="http://schemas.openxmlformats.org/drawingml/2006/main" noChangeAspect="1"/>
+            </wp:cNvGraphicFramePr>
+            <a:graphic xmlns:a="http://schemas.openxmlformats.org/drawingml/2006/main">
+              <a:graphicData uri="http://schemas.openxmlformats.org/drawingml/2006/picture">
+                <pic:pic xmlns:pic="http://schemas.openxmlformats.org/drawingml/2006/picture">
+                  <pic:nvPicPr>
+                    <pic:cNvPr id="0" name="Picture 12"/>
+                    <pic:cNvPicPr>
+                      <a:picLocks noChangeAspect="1" noChangeArrowheads="1"/>
+                    </pic:cNvPicPr>
+                  </pic:nvPicPr>
+                  <pic:blipFill>
+                    <a:blip r:embed="rId18" cstate="print">
+                      <a:extLst>
+                        <a:ext uri="{28A0092B-C50C-407E-A947-70E740481C1C}">
+                          <a14:useLocalDpi xmlns:a14="http://schemas.microsoft.com/office/drawing/2010/main" val="0"/>
+                        </a:ext>
+                      </a:extLst>
+                    </a:blip>
+                    <a:srcRect/>
+                    <a:stretch>
+                      <a:fillRect/>
+                    </a:stretch>
+                  </pic:blipFill>
+                  <pic:spPr bwMode="auto">
+                    <a:xfrm>
+                      <a:off x="0" y="0"/>
+                      <a:ext cx="5394960" cy="1303020"/>
+                    </a:xfrm>
+                    <a:prstGeom prst="rect">
+                      <a:avLst/>
+                    </a:prstGeom>
+                    <a:noFill/>
+                    <a:ln>
+                      <a:noFill/>
+                    </a:ln>
+                  </pic:spPr>
+                </pic:pic>
+              </a:graphicData>
+            </a:graphic>
+          </wp:inline>
+        </w:drawing>
+      </w:r>
+    </w:p>
+    <w:p>
+      <w:pPr>
+        <w:pStyle w:val="Sinespaciado"/>
+      </w:pPr>
+    </w:p>
+    <w:p>
+      <w:pPr>
+        <w:pStyle w:val="Sinespaciado"/>
+      </w:pPr>
+      <w:r>
+        <w:t>8. Arrancamos los servicios</w:t>
+      </w:r>
+    </w:p>
+    <w:p>
+      <w:pPr>
+        <w:pStyle w:val="Sinespaciado"/>
+      </w:pPr>
+      <w:r>
+        <w:t>- start-dfs.sh</w:t>
+      </w:r>
+    </w:p>
+    <w:p>
+      <w:pPr>
+        <w:pStyle w:val="Sinespaciado"/>
+      </w:pPr>
+      <w:r>
+        <w:rPr>
+          <w:noProof/>
+        </w:rPr>
+        <w:drawing>
+          <wp:inline distT="0" distB="0" distL="0" distR="0" wp14:anchorId="3E6EF89F" wp14:editId="5F752EDE">
+            <wp:extent cx="3779520" cy="1363980"/>
+            <wp:effectExtent l="0" t="0" r="0" b="7620"/>
+            <wp:docPr id="1318158027" name="Imagen 13"/>
+            <wp:cNvGraphicFramePr>
+              <a:graphicFrameLocks xmlns:a="http://schemas.openxmlformats.org/drawingml/2006/main" noChangeAspect="1"/>
+            </wp:cNvGraphicFramePr>
+            <a:graphic xmlns:a="http://schemas.openxmlformats.org/drawingml/2006/main">
+              <a:graphicData uri="http://schemas.openxmlformats.org/drawingml/2006/picture">
+                <pic:pic xmlns:pic="http://schemas.openxmlformats.org/drawingml/2006/picture">
+                  <pic:nvPicPr>
+                    <pic:cNvPr id="0" name="Picture 13"/>
+                    <pic:cNvPicPr>
+                      <a:picLocks noChangeAspect="1" noChangeArrowheads="1"/>
+                    </pic:cNvPicPr>
+                  </pic:nvPicPr>
+                  <pic:blipFill>
+                    <a:blip r:embed="rId19">
+                      <a:extLst>
+                        <a:ext uri="{28A0092B-C50C-407E-A947-70E740481C1C}">
+                          <a14:useLocalDpi xmlns:a14="http://schemas.microsoft.com/office/drawing/2010/main" val="0"/>
+                        </a:ext>
+                      </a:extLst>
+                    </a:blip>
+                    <a:srcRect/>
+                    <a:stretch>
+                      <a:fillRect/>
+                    </a:stretch>
+                  </pic:blipFill>
+                  <pic:spPr bwMode="auto">
+                    <a:xfrm>
+                      <a:off x="0" y="0"/>
+                      <a:ext cx="3779520" cy="1363980"/>
+                    </a:xfrm>
+                    <a:prstGeom prst="rect">
+                      <a:avLst/>
+                    </a:prstGeom>
+                    <a:noFill/>
+                    <a:ln>
+                      <a:noFill/>
+                    </a:ln>
+                  </pic:spPr>
+                </pic:pic>
+              </a:graphicData>
+            </a:graphic>
+          </wp:inline>
+        </w:drawing>
+      </w:r>
+    </w:p>
+    <w:p>
+      <w:pPr>
+        <w:pStyle w:val="Sinespaciado"/>
+      </w:pPr>
+      <w:r>
+        <w:t>- start-yarn</w:t>
+      </w:r>
+      <w:r>
+        <w:t>.sh</w:t>
+      </w:r>
+    </w:p>
+    <w:p>
+      <w:pPr>
+        <w:pStyle w:val="Sinespaciado"/>
+      </w:pPr>
+      <w:r>
+        <w:rPr>
+          <w:noProof/>
+        </w:rPr>
+        <w:drawing>
+          <wp:inline distT="0" distB="0" distL="0" distR="0" wp14:anchorId="6EC1BC72" wp14:editId="1E0264FB">
+            <wp:extent cx="4107180" cy="678180"/>
+            <wp:effectExtent l="0" t="0" r="7620" b="7620"/>
+            <wp:docPr id="394058923" name="Imagen 14"/>
+            <wp:cNvGraphicFramePr>
+              <a:graphicFrameLocks xmlns:a="http://schemas.openxmlformats.org/drawingml/2006/main" noChangeAspect="1"/>
+            </wp:cNvGraphicFramePr>
+            <a:graphic xmlns:a="http://schemas.openxmlformats.org/drawingml/2006/main">
+              <a:graphicData uri="http://schemas.openxmlformats.org/drawingml/2006/picture">
+                <pic:pic xmlns:pic="http://schemas.openxmlformats.org/drawingml/2006/picture">
+                  <pic:nvPicPr>
+                    <pic:cNvPr id="0" name="Picture 14"/>
+                    <pic:cNvPicPr>
+                      <a:picLocks noChangeAspect="1" noChangeArrowheads="1"/>
+                    </pic:cNvPicPr>
+                  </pic:nvPicPr>
+                  <pic:blipFill>
+                    <a:blip r:embed="rId20">
+                      <a:extLst>
+                        <a:ext uri="{28A0092B-C50C-407E-A947-70E740481C1C}">
+                          <a14:useLocalDpi xmlns:a14="http://schemas.microsoft.com/office/drawing/2010/main" val="0"/>
+                        </a:ext>
+                      </a:extLst>
+                    </a:blip>
+                    <a:srcRect/>
+                    <a:stretch>
+                      <a:fillRect/>
+                    </a:stretch>
+                  </pic:blipFill>
+                  <pic:spPr bwMode="auto">
+                    <a:xfrm>
+                      <a:off x="0" y="0"/>
+                      <a:ext cx="4107180" cy="678180"/>
+                    </a:xfrm>
+                    <a:prstGeom prst="rect">
+                      <a:avLst/>
+                    </a:prstGeom>
+                    <a:noFill/>
+                    <a:ln>
+                      <a:noFill/>
+                    </a:ln>
+                  </pic:spPr>
+                </pic:pic>
+              </a:graphicData>
+            </a:graphic>
+          </wp:inline>
+        </w:drawing>
+      </w:r>
+    </w:p>
+    <w:p>
+      <w:pPr>
+        <w:pStyle w:val="Sinespaciado"/>
+      </w:pPr>
+    </w:p>
+    <w:p>
+      <w:pPr>
+        <w:pStyle w:val="Sinespaciado"/>
+      </w:pPr>
+    </w:p>
+    <w:p>
+      <w:pPr>
+        <w:pStyle w:val="Sinespaciado"/>
+      </w:pPr>
+    </w:p>
+    <w:p>
+      <w:pPr>
+        <w:pStyle w:val="Sinespaciado"/>
+      </w:pPr>
+    </w:p>
+    <w:p>
+      <w:pPr>
+        <w:pStyle w:val="Sinespaciado"/>
+      </w:pPr>
+    </w:p>
+    <w:p>
+      <w:pPr>
+        <w:pStyle w:val="Sinespaciado"/>
+      </w:pPr>
+    </w:p>
+    <w:p>
+      <w:pPr>
+        <w:pStyle w:val="Sinespaciado"/>
+      </w:pPr>
+    </w:p>
+    <w:p>
+      <w:pPr>
+        <w:pStyle w:val="Sinespaciado"/>
+      </w:pPr>
+    </w:p>
+    <w:p>
+      <w:pPr>
+        <w:pStyle w:val="Sinespaciado"/>
+      </w:pPr>
+    </w:p>
+    <w:p>
+      <w:pPr>
+        <w:pStyle w:val="Sinespaciado"/>
+      </w:pPr>
+    </w:p>
+    <w:p>
+      <w:pPr>
+        <w:pStyle w:val="Sinespaciado"/>
+      </w:pPr>
+    </w:p>
+    <w:p>
+      <w:pPr>
+        <w:pStyle w:val="Sinespaciado"/>
+      </w:pPr>
+    </w:p>
+    <w:p>
+      <w:pPr>
+        <w:pStyle w:val="Sinespaciado"/>
+      </w:pPr>
+    </w:p>
+    <w:p>
+      <w:pPr>
+        <w:pStyle w:val="Sinespaciado"/>
+      </w:pPr>
+    </w:p>
+    <w:p>
+      <w:pPr>
+        <w:pStyle w:val="Sinespaciado"/>
+      </w:pPr>
+    </w:p>
+    <w:p>
+      <w:pPr>
+        <w:pStyle w:val="Sinespaciado"/>
+      </w:pPr>
+      <w:r>
+        <w:lastRenderedPageBreak/>
+        <w:t>Comprobamos que se han iniciado todos los servicios correctamente</w:t>
+      </w:r>
+    </w:p>
+    <w:p>
+      <w:pPr>
+        <w:pStyle w:val="Sinespaciado"/>
+      </w:pPr>
+      <w:r>
+        <w:t>- En el nodo1</w:t>
+      </w:r>
+    </w:p>
+    <w:p>
+      <w:pPr>
+        <w:pStyle w:val="Sinespaciado"/>
+      </w:pPr>
+      <w:r>
+        <w:rPr>
+          <w:noProof/>
+        </w:rPr>
+        <w:drawing>
+          <wp:inline distT="0" distB="0" distL="0" distR="0" wp14:anchorId="5103F9A3" wp14:editId="643ECBCC">
+            <wp:extent cx="1821180" cy="1318260"/>
+            <wp:effectExtent l="0" t="0" r="7620" b="0"/>
+            <wp:docPr id="2093294309" name="Imagen 1"/>
+            <wp:cNvGraphicFramePr>
+              <a:graphicFrameLocks xmlns:a="http://schemas.openxmlformats.org/drawingml/2006/main" noChangeAspect="1"/>
+            </wp:cNvGraphicFramePr>
+            <a:graphic xmlns:a="http://schemas.openxmlformats.org/drawingml/2006/main">
+              <a:graphicData uri="http://schemas.openxmlformats.org/drawingml/2006/picture">
+                <pic:pic xmlns:pic="http://schemas.openxmlformats.org/drawingml/2006/picture">
+                  <pic:nvPicPr>
+                    <pic:cNvPr id="0" name="Picture 1"/>
+                    <pic:cNvPicPr>
+                      <a:picLocks noChangeAspect="1" noChangeArrowheads="1"/>
+                    </pic:cNvPicPr>
+                  </pic:nvPicPr>
+                  <pic:blipFill>
+                    <a:blip r:embed="rId21">
+                      <a:extLst>
+                        <a:ext uri="{28A0092B-C50C-407E-A947-70E740481C1C}">
+                          <a14:useLocalDpi xmlns:a14="http://schemas.microsoft.com/office/drawing/2010/main" val="0"/>
+                        </a:ext>
+                      </a:extLst>
+                    </a:blip>
+                    <a:srcRect/>
+                    <a:stretch>
+                      <a:fillRect/>
+                    </a:stretch>
+                  </pic:blipFill>
+                  <pic:spPr bwMode="auto">
+                    <a:xfrm>
+                      <a:off x="0" y="0"/>
+                      <a:ext cx="1821180" cy="1318260"/>
+                    </a:xfrm>
+                    <a:prstGeom prst="rect">
+                      <a:avLst/>
+                    </a:prstGeom>
+                    <a:noFill/>
+                    <a:ln>
+                      <a:noFill/>
+                    </a:ln>
+                  </pic:spPr>
+                </pic:pic>
+              </a:graphicData>
+            </a:graphic>
+          </wp:inline>
+        </w:drawing>
+      </w:r>
+    </w:p>
+    <w:p>
+      <w:pPr>
+        <w:pStyle w:val="Sinespaciado"/>
+      </w:pPr>
+      <w:r>
+        <w:t>- En el nodo 2 y 3 aparece</w:t>
+      </w:r>
+    </w:p>
+    <w:p>
+      <w:pPr>
+        <w:pStyle w:val="Sinespaciado"/>
+      </w:pPr>
+      <w:r>
+        <w:rPr>
+          <w:noProof/>
+        </w:rPr>
+        <w:drawing>
+          <wp:inline distT="0" distB="0" distL="0" distR="0" wp14:anchorId="18DD35A6" wp14:editId="0018CD3F">
+            <wp:extent cx="1790700" cy="899160"/>
+            <wp:effectExtent l="0" t="0" r="0" b="0"/>
+            <wp:docPr id="1141496511" name="Imagen 2"/>
+            <wp:cNvGraphicFramePr>
+              <a:graphicFrameLocks xmlns:a="http://schemas.openxmlformats.org/drawingml/2006/main" noChangeAspect="1"/>
+            </wp:cNvGraphicFramePr>
+            <a:graphic xmlns:a="http://schemas.openxmlformats.org/drawingml/2006/main">
+              <a:graphicData uri="http://schemas.openxmlformats.org/drawingml/2006/picture">
+                <pic:pic xmlns:pic="http://schemas.openxmlformats.org/drawingml/2006/picture">
+                  <pic:nvPicPr>
+                    <pic:cNvPr id="0" name="Picture 2"/>
+                    <pic:cNvPicPr>
+                      <a:picLocks noChangeAspect="1" noChangeArrowheads="1"/>
+                    </pic:cNvPicPr>
+                  </pic:nvPicPr>
+                  <pic:blipFill>
+                    <a:blip r:embed="rId22">
+                      <a:extLst>
+                        <a:ext uri="{28A0092B-C50C-407E-A947-70E740481C1C}">
+                          <a14:useLocalDpi xmlns:a14="http://schemas.microsoft.com/office/drawing/2010/main" val="0"/>
+                        </a:ext>
+                      </a:extLst>
+                    </a:blip>
+                    <a:srcRect/>
+                    <a:stretch>
+                      <a:fillRect/>
+                    </a:stretch>
+                  </pic:blipFill>
+                  <pic:spPr bwMode="auto">
+                    <a:xfrm>
+                      <a:off x="0" y="0"/>
+                      <a:ext cx="1790700" cy="899160"/>
+                    </a:xfrm>
+                    <a:prstGeom prst="rect">
+                      <a:avLst/>
+                    </a:prstGeom>
+                    <a:noFill/>
+                    <a:ln>
+                      <a:noFill/>
+                    </a:ln>
+                  </pic:spPr>
+                </pic:pic>
+              </a:graphicData>
+            </a:graphic>
+          </wp:inline>
+        </w:drawing>
+      </w:r>
+    </w:p>
+    <w:p>
+      <w:pPr>
+        <w:pStyle w:val="Sinespaciado"/>
+      </w:pPr>
+    </w:p>
+    <w:p>
+      <w:pPr>
+        <w:pStyle w:val="Sinespaciado"/>
+      </w:pPr>
+      <w:r>
+        <w:t>9. Utilizamos MapReduce</w:t>
+      </w:r>
+    </w:p>
+    <w:p>
+      <w:pPr>
+        <w:pStyle w:val="Sinespaciado"/>
+      </w:pPr>
+      <w:r>
+        <w:t>- Creamos el directorio en HDFS</w:t>
+      </w:r>
+    </w:p>
+    <w:p>
+      <w:pPr>
+        <w:pStyle w:val="Sinespaciado"/>
+      </w:pPr>
+      <w:r>
+        <w:rPr>
+          <w:noProof/>
+        </w:rPr>
+        <w:drawing>
+          <wp:inline distT="0" distB="0" distL="0" distR="0" wp14:anchorId="4AB490AD" wp14:editId="71F8F78B">
+            <wp:extent cx="4556760" cy="449580"/>
+            <wp:effectExtent l="0" t="0" r="0" b="7620"/>
+            <wp:docPr id="666764072" name="Imagen 3"/>
+            <wp:cNvGraphicFramePr>
+              <a:graphicFrameLocks xmlns:a="http://schemas.openxmlformats.org/drawingml/2006/main" noChangeAspect="1"/>
+            </wp:cNvGraphicFramePr>
+            <a:graphic xmlns:a="http://schemas.openxmlformats.org/drawingml/2006/main">
+              <a:graphicData uri="http://schemas.openxmlformats.org/drawingml/2006/picture">
+                <pic:pic xmlns:pic="http://schemas.openxmlformats.org/drawingml/2006/picture">
+                  <pic:nvPicPr>
+                    <pic:cNvPr id="0" name="Picture 3"/>
+                    <pic:cNvPicPr>
+                      <a:picLocks noChangeAspect="1" noChangeArrowheads="1"/>
+                    </pic:cNvPicPr>
+                  </pic:nvPicPr>
+                  <pic:blipFill>
+                    <a:blip r:embed="rId23">
+                      <a:extLst>
+                        <a:ext uri="{28A0092B-C50C-407E-A947-70E740481C1C}">
+                          <a14:useLocalDpi xmlns:a14="http://schemas.microsoft.com/office/drawing/2010/main" val="0"/>
+                        </a:ext>
+                      </a:extLst>
+                    </a:blip>
+                    <a:srcRect/>
+                    <a:stretch>
+                      <a:fillRect/>
+                    </a:stretch>
+                  </pic:blipFill>
+                  <pic:spPr bwMode="auto">
+                    <a:xfrm>
+                      <a:off x="0" y="0"/>
+                      <a:ext cx="4556760" cy="449580"/>
+                    </a:xfrm>
+                    <a:prstGeom prst="rect">
+                      <a:avLst/>
+                    </a:prstGeom>
+                    <a:noFill/>
+                    <a:ln>
+                      <a:noFill/>
+                    </a:ln>
+                  </pic:spPr>
+                </pic:pic>
+              </a:graphicData>
+            </a:graphic>
+          </wp:inline>
+        </w:drawing>
+      </w:r>
+    </w:p>
+    <w:p>
+      <w:pPr>
+        <w:pStyle w:val="Sinespaciado"/>
+      </w:pPr>
+      <w:r>
+        <w:t>- Creamos y subimos el archivo prueba.txt</w:t>
+      </w:r>
+    </w:p>
+    <w:p>
+      <w:pPr>
+        <w:pStyle w:val="Sinespaciado"/>
+      </w:pPr>
+      <w:r>
+        <w:rPr>
+          <w:noProof/>
+        </w:rPr>
+        <w:drawing>
+          <wp:inline distT="0" distB="0" distL="0" distR="0" wp14:anchorId="325F8E66" wp14:editId="1ED7D528">
+            <wp:extent cx="5387340" cy="1112520"/>
+            <wp:effectExtent l="0" t="0" r="3810" b="0"/>
+            <wp:docPr id="1052891520" name="Imagen 4"/>
+            <wp:cNvGraphicFramePr>
+              <a:graphicFrameLocks xmlns:a="http://schemas.openxmlformats.org/drawingml/2006/main" noChangeAspect="1"/>
+            </wp:cNvGraphicFramePr>
+            <a:graphic xmlns:a="http://schemas.openxmlformats.org/drawingml/2006/main">
+              <a:graphicData uri="http://schemas.openxmlformats.org/drawingml/2006/picture">
+                <pic:pic xmlns:pic="http://schemas.openxmlformats.org/drawingml/2006/picture">
+                  <pic:nvPicPr>
+                    <pic:cNvPr id="0" name="Picture 4"/>
+                    <pic:cNvPicPr>
+                      <a:picLocks noChangeAspect="1" noChangeArrowheads="1"/>
+                    </pic:cNvPicPr>
+                  </pic:nvPicPr>
+                  <pic:blipFill>
+                    <a:blip r:embed="rId24" cstate="print">
+                      <a:extLst>
+                        <a:ext uri="{28A0092B-C50C-407E-A947-70E740481C1C}">
+                          <a14:useLocalDpi xmlns:a14="http://schemas.microsoft.com/office/drawing/2010/main" val="0"/>
+                        </a:ext>
+                      </a:extLst>
+                    </a:blip>
+                    <a:srcRect/>
+                    <a:stretch>
+                      <a:fillRect/>
+                    </a:stretch>
+                  </pic:blipFill>
+                  <pic:spPr bwMode="auto">
+                    <a:xfrm>
+                      <a:off x="0" y="0"/>
+                      <a:ext cx="5387340" cy="1112520"/>
+                    </a:xfrm>
+                    <a:prstGeom prst="rect">
+                      <a:avLst/>
+                    </a:prstGeom>
+                    <a:noFill/>
+                    <a:ln>
+                      <a:noFill/>
+                    </a:ln>
+                  </pic:spPr>
+                </pic:pic>
+              </a:graphicData>
+            </a:graphic>
+          </wp:inline>
+        </w:drawing>
+      </w:r>
+    </w:p>
+    <w:p>
+      <w:pPr>
+        <w:pStyle w:val="Sinespaciado"/>
+      </w:pPr>
+      <w:r>
+        <w:t xml:space="preserve">- Ejecutamos el </w:t>
+      </w:r>
+      <w:proofErr w:type="spellStart"/>
+      <w:r>
+        <w:t>WordCount</w:t>
+      </w:r>
+      <w:proofErr w:type="spellEnd"/>
+    </w:p>
+    <w:p>
+      <w:pPr>
+        <w:pStyle w:val="Sinespaciado"/>
+      </w:pPr>
+      <w:r>
+        <w:rPr>
+          <w:noProof/>
+        </w:rPr>
+        <w:drawing>
+          <wp:inline distT="0" distB="0" distL="0" distR="0" wp14:anchorId="19F605EE" wp14:editId="55AA1E9E">
+            <wp:extent cx="5400040" cy="3169920"/>
+            <wp:effectExtent l="0" t="0" r="0" b="0"/>
+            <wp:docPr id="1676225108" name="Imagen 1"/>
+            <wp:cNvGraphicFramePr>
+              <a:graphicFrameLocks xmlns:a="http://schemas.openxmlformats.org/drawingml/2006/main" noChangeAspect="1"/>
+            </wp:cNvGraphicFramePr>
+            <a:graphic xmlns:a="http://schemas.openxmlformats.org/drawingml/2006/main">
+              <a:graphicData uri="http://schemas.openxmlformats.org/drawingml/2006/picture">
+                <pic:pic xmlns:pic="http://schemas.openxmlformats.org/drawingml/2006/picture">
+                  <pic:nvPicPr>
+                    <pic:cNvPr id="1676225108" name=""/>
                     <pic:cNvPicPr/>
                   </pic:nvPicPr>
                   <pic:blipFill>
-                    <a:blip r:embed="rId8"/>
+                    <a:blip r:embed="rId25"/>
                     <a:stretch>
                       <a:fillRect/>
                     </a:stretch>
@@ -300,7 +1684,7 @@
                   <pic:spPr>
                     <a:xfrm>
                       <a:off x="0" y="0"/>
-                      <a:ext cx="1733550" cy="542925"/>
+                      <a:ext cx="5400040" cy="3169920"/>
                     </a:xfrm>
                     <a:prstGeom prst="rect">
                       <a:avLst/>
@@ -312,6 +1696,267 @@
           </wp:inline>
         </w:drawing>
       </w:r>
+    </w:p>
+    <w:p>
+      <w:pPr>
+        <w:pStyle w:val="Sinespaciado"/>
+      </w:pPr>
+      <w:r>
+        <w:rPr>
+          <w:noProof/>
+        </w:rPr>
+        <w:lastRenderedPageBreak/>
+        <w:drawing>
+          <wp:inline distT="0" distB="0" distL="0" distR="0" wp14:anchorId="0B4FB87F" wp14:editId="0C6593D7">
+            <wp:extent cx="5000625" cy="5591175"/>
+            <wp:effectExtent l="0" t="0" r="9525" b="9525"/>
+            <wp:docPr id="815172475" name="Imagen 1"/>
+            <wp:cNvGraphicFramePr>
+              <a:graphicFrameLocks xmlns:a="http://schemas.openxmlformats.org/drawingml/2006/main" noChangeAspect="1"/>
+            </wp:cNvGraphicFramePr>
+            <a:graphic xmlns:a="http://schemas.openxmlformats.org/drawingml/2006/main">
+              <a:graphicData uri="http://schemas.openxmlformats.org/drawingml/2006/picture">
+                <pic:pic xmlns:pic="http://schemas.openxmlformats.org/drawingml/2006/picture">
+                  <pic:nvPicPr>
+                    <pic:cNvPr id="815172475" name=""/>
+                    <pic:cNvPicPr/>
+                  </pic:nvPicPr>
+                  <pic:blipFill>
+                    <a:blip r:embed="rId26"/>
+                    <a:stretch>
+                      <a:fillRect/>
+                    </a:stretch>
+                  </pic:blipFill>
+                  <pic:spPr>
+                    <a:xfrm>
+                      <a:off x="0" y="0"/>
+                      <a:ext cx="5000625" cy="5591175"/>
+                    </a:xfrm>
+                    <a:prstGeom prst="rect">
+                      <a:avLst/>
+                    </a:prstGeom>
+                  </pic:spPr>
+                </pic:pic>
+              </a:graphicData>
+            </a:graphic>
+          </wp:inline>
+        </w:drawing>
+      </w:r>
+    </w:p>
+    <w:p>
+      <w:pPr>
+        <w:pStyle w:val="Sinespaciado"/>
+      </w:pPr>
+    </w:p>
+    <w:p>
+      <w:pPr>
+        <w:pStyle w:val="Sinespaciado"/>
+      </w:pPr>
+    </w:p>
+    <w:p>
+      <w:pPr>
+        <w:pStyle w:val="Sinespaciado"/>
+      </w:pPr>
+      <w:r>
+        <w:t>10. Yarn avanzado</w:t>
+      </w:r>
+    </w:p>
+    <w:p>
+      <w:pPr>
+        <w:pStyle w:val="Sinespaciado"/>
+      </w:pPr>
+      <w:r>
+        <w:rPr>
+          <w:noProof/>
+        </w:rPr>
+        <w:drawing>
+          <wp:inline distT="0" distB="0" distL="0" distR="0" wp14:anchorId="4ED4AD1B" wp14:editId="0A4FEF1D">
+            <wp:extent cx="5400040" cy="532130"/>
+            <wp:effectExtent l="0" t="0" r="0" b="1270"/>
+            <wp:docPr id="1007384296" name="Imagen 1"/>
+            <wp:cNvGraphicFramePr>
+              <a:graphicFrameLocks xmlns:a="http://schemas.openxmlformats.org/drawingml/2006/main" noChangeAspect="1"/>
+            </wp:cNvGraphicFramePr>
+            <a:graphic xmlns:a="http://schemas.openxmlformats.org/drawingml/2006/main">
+              <a:graphicData uri="http://schemas.openxmlformats.org/drawingml/2006/picture">
+                <pic:pic xmlns:pic="http://schemas.openxmlformats.org/drawingml/2006/picture">
+                  <pic:nvPicPr>
+                    <pic:cNvPr id="1007384296" name=""/>
+                    <pic:cNvPicPr/>
+                  </pic:nvPicPr>
+                  <pic:blipFill>
+                    <a:blip r:embed="rId27"/>
+                    <a:stretch>
+                      <a:fillRect/>
+                    </a:stretch>
+                  </pic:blipFill>
+                  <pic:spPr>
+                    <a:xfrm>
+                      <a:off x="0" y="0"/>
+                      <a:ext cx="5400040" cy="532130"/>
+                    </a:xfrm>
+                    <a:prstGeom prst="rect">
+                      <a:avLst/>
+                    </a:prstGeom>
+                  </pic:spPr>
+                </pic:pic>
+              </a:graphicData>
+            </a:graphic>
+          </wp:inline>
+        </w:drawing>
+      </w:r>
+      <w:r>
+        <w:rPr>
+          <w:noProof/>
+        </w:rPr>
+        <w:drawing>
+          <wp:inline distT="0" distB="0" distL="0" distR="0" wp14:anchorId="62E4CC79" wp14:editId="4140CF4D">
+            <wp:extent cx="5400040" cy="300990"/>
+            <wp:effectExtent l="0" t="0" r="0" b="3810"/>
+            <wp:docPr id="1965606869" name="Imagen 1"/>
+            <wp:cNvGraphicFramePr>
+              <a:graphicFrameLocks xmlns:a="http://schemas.openxmlformats.org/drawingml/2006/main" noChangeAspect="1"/>
+            </wp:cNvGraphicFramePr>
+            <a:graphic xmlns:a="http://schemas.openxmlformats.org/drawingml/2006/main">
+              <a:graphicData uri="http://schemas.openxmlformats.org/drawingml/2006/picture">
+                <pic:pic xmlns:pic="http://schemas.openxmlformats.org/drawingml/2006/picture">
+                  <pic:nvPicPr>
+                    <pic:cNvPr id="1965606869" name=""/>
+                    <pic:cNvPicPr/>
+                  </pic:nvPicPr>
+                  <pic:blipFill>
+                    <a:blip r:embed="rId28"/>
+                    <a:stretch>
+                      <a:fillRect/>
+                    </a:stretch>
+                  </pic:blipFill>
+                  <pic:spPr>
+                    <a:xfrm>
+                      <a:off x="0" y="0"/>
+                      <a:ext cx="5400040" cy="300990"/>
+                    </a:xfrm>
+                    <a:prstGeom prst="rect">
+                      <a:avLst/>
+                    </a:prstGeom>
+                  </pic:spPr>
+                </pic:pic>
+              </a:graphicData>
+            </a:graphic>
+          </wp:inline>
+        </w:drawing>
+      </w:r>
+    </w:p>
+    <w:p>
+      <w:pPr>
+        <w:pStyle w:val="Sinespaciado"/>
+      </w:pPr>
+      <w:r>
+        <w:rPr>
+          <w:noProof/>
+        </w:rPr>
+        <w:lastRenderedPageBreak/>
+        <w:drawing>
+          <wp:inline distT="0" distB="0" distL="0" distR="0" wp14:anchorId="75BF08E3" wp14:editId="579D0371">
+            <wp:extent cx="5400040" cy="3348990"/>
+            <wp:effectExtent l="0" t="0" r="0" b="3810"/>
+            <wp:docPr id="678398535" name="Imagen 1"/>
+            <wp:cNvGraphicFramePr>
+              <a:graphicFrameLocks xmlns:a="http://schemas.openxmlformats.org/drawingml/2006/main" noChangeAspect="1"/>
+            </wp:cNvGraphicFramePr>
+            <a:graphic xmlns:a="http://schemas.openxmlformats.org/drawingml/2006/main">
+              <a:graphicData uri="http://schemas.openxmlformats.org/drawingml/2006/picture">
+                <pic:pic xmlns:pic="http://schemas.openxmlformats.org/drawingml/2006/picture">
+                  <pic:nvPicPr>
+                    <pic:cNvPr id="678398535" name=""/>
+                    <pic:cNvPicPr/>
+                  </pic:nvPicPr>
+                  <pic:blipFill>
+                    <a:blip r:embed="rId29"/>
+                    <a:stretch>
+                      <a:fillRect/>
+                    </a:stretch>
+                  </pic:blipFill>
+                  <pic:spPr>
+                    <a:xfrm>
+                      <a:off x="0" y="0"/>
+                      <a:ext cx="5400040" cy="3348990"/>
+                    </a:xfrm>
+                    <a:prstGeom prst="rect">
+                      <a:avLst/>
+                    </a:prstGeom>
+                  </pic:spPr>
+                </pic:pic>
+              </a:graphicData>
+            </a:graphic>
+          </wp:inline>
+        </w:drawing>
+      </w:r>
+    </w:p>
+    <w:p>
+      <w:pPr>
+        <w:pStyle w:val="Sinespaciado"/>
+      </w:pPr>
+      <w:r>
+        <w:rPr>
+          <w:noProof/>
+        </w:rPr>
+        <w:lastRenderedPageBreak/>
+        <w:drawing>
+          <wp:inline distT="0" distB="0" distL="0" distR="0" wp14:anchorId="142EBFD8" wp14:editId="60828D25">
+            <wp:extent cx="4953000" cy="5657850"/>
+            <wp:effectExtent l="0" t="0" r="0" b="0"/>
+            <wp:docPr id="24761005" name="Imagen 1"/>
+            <wp:cNvGraphicFramePr>
+              <a:graphicFrameLocks xmlns:a="http://schemas.openxmlformats.org/drawingml/2006/main" noChangeAspect="1"/>
+            </wp:cNvGraphicFramePr>
+            <a:graphic xmlns:a="http://schemas.openxmlformats.org/drawingml/2006/main">
+              <a:graphicData uri="http://schemas.openxmlformats.org/drawingml/2006/picture">
+                <pic:pic xmlns:pic="http://schemas.openxmlformats.org/drawingml/2006/picture">
+                  <pic:nvPicPr>
+                    <pic:cNvPr id="24761005" name=""/>
+                    <pic:cNvPicPr/>
+                  </pic:nvPicPr>
+                  <pic:blipFill>
+                    <a:blip r:embed="rId30"/>
+                    <a:stretch>
+                      <a:fillRect/>
+                    </a:stretch>
+                  </pic:blipFill>
+                  <pic:spPr>
+                    <a:xfrm>
+                      <a:off x="0" y="0"/>
+                      <a:ext cx="4953000" cy="5657850"/>
+                    </a:xfrm>
+                    <a:prstGeom prst="rect">
+                      <a:avLst/>
+                    </a:prstGeom>
+                  </pic:spPr>
+                </pic:pic>
+              </a:graphicData>
+            </a:graphic>
+          </wp:inline>
+        </w:drawing>
+      </w:r>
+    </w:p>
+    <w:p>
+      <w:pPr>
+        <w:pStyle w:val="Sinespaciado"/>
+      </w:pPr>
+    </w:p>
+    <w:p>
+      <w:pPr>
+        <w:pStyle w:val="Sinespaciado"/>
+      </w:pPr>
+    </w:p>
+    <w:p>
+      <w:pPr>
+        <w:pStyle w:val="Sinespaciado"/>
+      </w:pPr>
+    </w:p>
+    <w:p>
+      <w:pPr>
+        <w:pStyle w:val="Sinespaciado"/>
+      </w:pPr>
     </w:p>
     <w:sectPr>
       <w:pgSz w:w="11906" w:h="16838"/>

</xml_diff>